<commit_message>
Add human evaluation results to demo and documentation
</commit_message>
<xml_diff>
--- a/English-to-Venetian_Extended_Abstract_IEEE.docx
+++ b/English-to-Venetian_Extended_Abstract_IEEE.docx
@@ -234,19 +234,16 @@
           <w:b/>
           <w:i/>
           <w:sz w:val="17"/>
-          <w:caps w:val="0"/>
         </w:rPr>
         <w:t>Abstract—</w:t>
       </w:r>
       <w:r>
         <w:rPr>
           <w:rFonts w:ascii="Times New Roman" w:hAnsi="Times New Roman"/>
-          <w:b w:val="0"/>
           <w:i/>
           <w:sz w:val="17"/>
-          <w:caps w:val="0"/>
         </w:rPr>
-        <w:t>This extended abstract investigates the adaptation of NLLB-200 to English-to-Venetian machine translation under severe data scarcity. An expanded parallel corpus was assembled from curated manual material and Wikipedia-derived candidates, while development and test data were sampled from a FLORES-derived evaluation pool and processed with conservative orthographic and lexical normalization. The NLLB-200 distilled 600M model was compared in zero-shot and fine-tuned settings, together with a general-purpose LLM zero-shot baseline. The final splits contained 653 training, 82 development, and 82 test sentence pairs. On the test set, NLLB zero-shot obtained 15.89 BLEU and 49.97 chrF; the LLM baseline reached 16.43 BLEU and 49.74 chrF; and fine-tuned NLLB achieved 16.07 BLEU and 51.50 chrF. Fine-tuning therefore improved the original NLLB baseline by 0.18 BLEU and 1.53 chrF, yielding the best character-level score. The results demonstrate measurable adaptation gains while highlighting the continuing effects of domain mismatch, orthographic variation, and single-reference evaluation in low-resource regional-language translation.</w:t>
+        <w:t>This extended abstract studies NLLB-200 adaptation for English-to-Venetian machine translation under severe data scarcity. An expanded 653-pair training corpus was assembled from curated manual material and Wikipedia-derived candidates; 82-sentence development and test sets came from a FLORES-derived pool. Conservative normalization addressed orthographic and lexical variation. We compare the NLLB-200 distilled 600M model in zero-shot and fine-tuned settings with a general-purpose LLM zero-shot baseline. Evaluation combines BLEU, chrF, and manual ratings on a 1–5 scale for every test output. NLLB zero-shot scored 15.89 BLEU, 49.97 chrF, and 3.43 in mean human rating; the LLM reached 16.43, 49.74, and 3.61; and fine-tuned NLLB achieved 16.07, 51.50, and 3.57. Fine-tuning improves the NLLB baseline by 0.18 BLEU, 1.53 chrF, and 0.14 human-rating points; the LLM leads on BLEU and human rating, while fine-tuned NLLB leads on chrF. The results show measurable adaptation gains while highlighting domain mismatch, orthographic variation, and single-reference limitations.</w:t>
       </w:r>
     </w:p>
     <w:p>
@@ -263,7 +260,6 @@
           <w:b/>
           <w:i/>
           <w:sz w:val="17"/>
-          <w:caps w:val="0"/>
         </w:rPr>
         <w:t>Keywords—</w:t>
       </w:r>
@@ -273,9 +269,8 @@
           <w:b w:val="0"/>
           <w:i/>
           <w:sz w:val="17"/>
-          <w:caps w:val="0"/>
         </w:rPr>
-        <w:t>low-resource machine translation, Venetian, NLLB-200, fine-tuning, large language models, BLEU, chrF</w:t>
+        <w:t>low-resource machine translation, Venetian, NLLB-200, fine-tuning, large language models, BLEU, chrF, human evaluation</w:t>
       </w:r>
     </w:p>
     <w:p>
@@ -342,9 +337,8 @@
           <w:b w:val="0"/>
           <w:i w:val="0"/>
           <w:sz w:val="20"/>
-          <w:caps w:val="0"/>
         </w:rPr>
-        <w:t>NLLB-200 was developed to extend multilingual translation to approximately 200 languages, with particular attention to low-resource settings [1]. Related work on Genoese has shown both the promise and limitations of NLLB-200 for Italian regional languages, especially where local vocabulary and non-standardized writing are involved [5]. We study whether an expanded English-to-Venetian corpus can improve the distilled 600M-parameter NLLB model over its zero-shot behavior. The contribution is an end-to-end reproducible pipeline covering data preparation, normalization, supervised adaptation, comparison with both NLLB and general-purpose zero-shot baselines, automatic evaluation, and sentence-level inspection.</w:t>
+        <w:t>NLLB-200 was developed to extend multilingual translation to approximately 200 languages, with particular attention to low-resource settings [1]. Related work on Genoese has shown both the promise and limitations of NLLB-200 for Italian regional languages, especially where local vocabulary and non-standardized writing are involved [5]. We study whether an expanded English-to-Venetian corpus can improve the distilled 600M-parameter NLLB model over its zero-shot behavior. The contribution is an end-to-end reproducible pipeline covering data preparation, normalization, supervised adaptation, comparison with both NLLB and general-purpose zero-shot baselines, automatic and human evaluation, and sentence-level inspection.</w:t>
       </w:r>
     </w:p>
     <w:p>
@@ -558,9 +552,8 @@
           <w:b w:val="0"/>
           <w:i w:val="0"/>
           <w:sz w:val="20"/>
-          <w:caps w:val="0"/>
         </w:rPr>
-        <w:t>We report corpus-level BLEU, based on modified word n-gram precision and a brevity penalty [3], and chrF, an F-score over character n-grams [4]. chrF is particularly informative because character overlap is less brittle than word matching in the presence of inflectional and orthographic variation. We also inspect sentence-level chrF differences and representative outputs to identify local gains and regressions.</w:t>
+        <w:t>We report corpus-level BLEU, based on modified word n-gram precision and a brevity penalty [3], and chrF, an F-score over character n-grams [4]. chrF is particularly informative because character overlap is less brittle than word matching in the presence of inflectional and orthographic variation. Each of the 82 outputs from the three principal systems also has a saved manual rating on a 1–5 scale. Mean human ratings complement reference-overlap metrics, while sentence-level chrF differences identify local gains and regressions.</w:t>
       </w:r>
     </w:p>
     <w:p>
@@ -596,9 +589,8 @@
           <w:b w:val="0"/>
           <w:i w:val="0"/>
           <w:sz w:val="16"/>
-          <w:caps/>
         </w:rPr>
-        <w:t>TEST-SET RESULTS (82 SENTENCES)</w:t>
+        <w:t>TEST-SET AUTOMATIC AND HUMAN RESULTS (82 SENTENCES)</w:t>
       </w:r>
     </w:p>
     <w:tbl>
@@ -617,9 +609,10 @@
         </w:tblBorders>
       </w:tblPr>
       <w:tblGrid>
-        <w:gridCol w:w="2304"/>
-        <w:gridCol w:w="1051"/>
-        <w:gridCol w:w="1051"/>
+        <w:gridCol w:w="1829"/>
+        <w:gridCol w:w="720"/>
+        <w:gridCol w:w="720"/>
+        <w:gridCol w:w="1123"/>
       </w:tblGrid>
       <w:tr>
         <w:trPr>
@@ -628,7 +621,7 @@
         </w:trPr>
         <w:tc>
           <w:tcPr>
-            <w:tcW w:type="dxa" w:w="2304"/>
+            <w:tcW w:type="dxa" w:w="1829"/>
             <w:vAlign w:val="center"/>
             <w:tcMar>
               <w:top w:w="40" w:type="dxa"/>
@@ -639,11 +632,15 @@
             <w:shd w:fill="D9D9D9"/>
           </w:tcPr>
           <w:p>
+            <w:pPr>
+              <w:spacing w:before="0" w:after="0"/>
+              <w:jc w:val="left"/>
+            </w:pPr>
             <w:r>
               <w:rPr>
                 <w:rFonts w:ascii="Times New Roman" w:hAnsi="Times New Roman"/>
                 <w:b/>
-                <w:sz w:val="16"/>
+                <w:sz w:val="15"/>
               </w:rPr>
               <w:t>System</w:t>
             </w:r>
@@ -651,7 +648,7 @@
         </w:tc>
         <w:tc>
           <w:tcPr>
-            <w:tcW w:type="dxa" w:w="1051"/>
+            <w:tcW w:type="dxa" w:w="720"/>
             <w:vAlign w:val="center"/>
             <w:tcMar>
               <w:top w:w="40" w:type="dxa"/>
@@ -662,11 +659,15 @@
             <w:shd w:fill="D9D9D9"/>
           </w:tcPr>
           <w:p>
+            <w:pPr>
+              <w:spacing w:before="0" w:after="0"/>
+              <w:jc w:val="center"/>
+            </w:pPr>
             <w:r>
               <w:rPr>
                 <w:rFonts w:ascii="Times New Roman" w:hAnsi="Times New Roman"/>
                 <w:b/>
-                <w:sz w:val="16"/>
+                <w:sz w:val="15"/>
               </w:rPr>
               <w:t>BLEU</w:t>
             </w:r>
@@ -674,7 +675,7 @@
         </w:tc>
         <w:tc>
           <w:tcPr>
-            <w:tcW w:type="dxa" w:w="1051"/>
+            <w:tcW w:type="dxa" w:w="720"/>
             <w:vAlign w:val="center"/>
             <w:tcMar>
               <w:top w:w="40" w:type="dxa"/>
@@ -685,13 +686,40 @@
             <w:shd w:fill="D9D9D9"/>
           </w:tcPr>
           <w:p>
+            <w:pPr>
+              <w:spacing w:before="0" w:after="0"/>
+              <w:jc w:val="center"/>
+            </w:pPr>
             <w:r>
               <w:rPr>
                 <w:rFonts w:ascii="Times New Roman" w:hAnsi="Times New Roman"/>
                 <w:b/>
-                <w:sz w:val="16"/>
+                <w:sz w:val="15"/>
               </w:rPr>
               <w:t>chrF</w:t>
+            </w:r>
+          </w:p>
+        </w:tc>
+        <w:tc>
+          <w:tcPr>
+            <w:tcW w:type="dxa" w:w="1123"/>
+            <w:shd w:fill="D9D9D9"/>
+            <w:vAlign w:val="center"/>
+          </w:tcPr>
+          <w:p>
+            <w:pPr>
+              <w:spacing w:before="0" w:after="0"/>
+              <w:jc w:val="center"/>
+            </w:pPr>
+            <w:r>
+              <w:rPr>
+                <w:rFonts w:ascii="Times New Roman" w:hAnsi="Times New Roman"/>
+                <w:b/>
+                <w:sz w:val="15"/>
+              </w:rPr>
+              <w:t>Human</w:t>
+              <w:br/>
+              <w:t>(1–5)</w:t>
             </w:r>
           </w:p>
         </w:tc>
@@ -702,7 +730,7 @@
         </w:trPr>
         <w:tc>
           <w:tcPr>
-            <w:tcW w:type="dxa" w:w="2304"/>
+            <w:tcW w:type="dxa" w:w="1829"/>
             <w:vAlign w:val="center"/>
             <w:tcMar>
               <w:top w:w="40" w:type="dxa"/>
@@ -712,11 +740,15 @@
             </w:tcMar>
           </w:tcPr>
           <w:p>
+            <w:pPr>
+              <w:spacing w:before="0" w:after="0"/>
+              <w:jc w:val="left"/>
+            </w:pPr>
             <w:r>
               <w:rPr>
                 <w:rFonts w:ascii="Times New Roman" w:hAnsi="Times New Roman"/>
                 <w:b w:val="0"/>
-                <w:sz w:val="16"/>
+                <w:sz w:val="15"/>
               </w:rPr>
               <w:t>NLLB zero-shot</w:t>
             </w:r>
@@ -724,7 +756,7 @@
         </w:tc>
         <w:tc>
           <w:tcPr>
-            <w:tcW w:type="dxa" w:w="1051"/>
+            <w:tcW w:type="dxa" w:w="720"/>
             <w:vAlign w:val="center"/>
             <w:tcMar>
               <w:top w:w="40" w:type="dxa"/>
@@ -734,11 +766,15 @@
             </w:tcMar>
           </w:tcPr>
           <w:p>
+            <w:pPr>
+              <w:spacing w:before="0" w:after="0"/>
+              <w:jc w:val="center"/>
+            </w:pPr>
             <w:r>
               <w:rPr>
                 <w:rFonts w:ascii="Times New Roman" w:hAnsi="Times New Roman"/>
                 <w:b w:val="0"/>
-                <w:sz w:val="16"/>
+                <w:sz w:val="15"/>
               </w:rPr>
               <w:t>15.89</w:t>
             </w:r>
@@ -746,7 +782,7 @@
         </w:tc>
         <w:tc>
           <w:tcPr>
-            <w:tcW w:type="dxa" w:w="1051"/>
+            <w:tcW w:type="dxa" w:w="720"/>
             <w:vAlign w:val="center"/>
             <w:tcMar>
               <w:top w:w="40" w:type="dxa"/>
@@ -756,13 +792,37 @@
             </w:tcMar>
           </w:tcPr>
           <w:p>
+            <w:pPr>
+              <w:spacing w:before="0" w:after="0"/>
+              <w:jc w:val="center"/>
+            </w:pPr>
             <w:r>
               <w:rPr>
                 <w:rFonts w:ascii="Times New Roman" w:hAnsi="Times New Roman"/>
                 <w:b w:val="0"/>
-                <w:sz w:val="16"/>
+                <w:sz w:val="15"/>
               </w:rPr>
               <w:t>49.97</w:t>
+            </w:r>
+          </w:p>
+        </w:tc>
+        <w:tc>
+          <w:tcPr>
+            <w:tcW w:type="dxa" w:w="1123"/>
+            <w:vAlign w:val="center"/>
+          </w:tcPr>
+          <w:p>
+            <w:pPr>
+              <w:spacing w:before="0" w:after="0"/>
+              <w:jc w:val="center"/>
+            </w:pPr>
+            <w:r>
+              <w:rPr>
+                <w:rFonts w:ascii="Times New Roman" w:hAnsi="Times New Roman"/>
+                <w:b w:val="0"/>
+                <w:sz w:val="15"/>
+              </w:rPr>
+              <w:t>3.43</w:t>
             </w:r>
           </w:p>
         </w:tc>
@@ -773,7 +833,7 @@
         </w:trPr>
         <w:tc>
           <w:tcPr>
-            <w:tcW w:type="dxa" w:w="2304"/>
+            <w:tcW w:type="dxa" w:w="1829"/>
             <w:vAlign w:val="center"/>
             <w:tcMar>
               <w:top w:w="40" w:type="dxa"/>
@@ -783,19 +843,23 @@
             </w:tcMar>
           </w:tcPr>
           <w:p>
+            <w:pPr>
+              <w:spacing w:before="0" w:after="0"/>
+              <w:jc w:val="left"/>
+            </w:pPr>
             <w:r>
               <w:rPr>
                 <w:rFonts w:ascii="Times New Roman" w:hAnsi="Times New Roman"/>
                 <w:b w:val="0"/>
-                <w:sz w:val="16"/>
+                <w:sz w:val="15"/>
               </w:rPr>
-              <w:t>NLLB fine-tuned</w:t>
+              <w:t>LLM zero-shot</w:t>
             </w:r>
           </w:p>
         </w:tc>
         <w:tc>
           <w:tcPr>
-            <w:tcW w:type="dxa" w:w="1051"/>
+            <w:tcW w:type="dxa" w:w="720"/>
             <w:vAlign w:val="center"/>
             <w:tcMar>
               <w:top w:w="40" w:type="dxa"/>
@@ -805,19 +869,23 @@
             </w:tcMar>
           </w:tcPr>
           <w:p>
+            <w:pPr>
+              <w:spacing w:before="0" w:after="0"/>
+              <w:jc w:val="center"/>
+            </w:pPr>
             <w:r>
               <w:rPr>
                 <w:rFonts w:ascii="Times New Roman" w:hAnsi="Times New Roman"/>
                 <w:b w:val="0"/>
-                <w:sz w:val="16"/>
+                <w:sz w:val="15"/>
               </w:rPr>
-              <w:t>16.07</w:t>
+              <w:t>16.43</w:t>
             </w:r>
           </w:p>
         </w:tc>
         <w:tc>
           <w:tcPr>
-            <w:tcW w:type="dxa" w:w="1051"/>
+            <w:tcW w:type="dxa" w:w="720"/>
             <w:vAlign w:val="center"/>
             <w:tcMar>
               <w:top w:w="40" w:type="dxa"/>
@@ -827,13 +895,37 @@
             </w:tcMar>
           </w:tcPr>
           <w:p>
+            <w:pPr>
+              <w:spacing w:before="0" w:after="0"/>
+              <w:jc w:val="center"/>
+            </w:pPr>
             <w:r>
               <w:rPr>
                 <w:rFonts w:ascii="Times New Roman" w:hAnsi="Times New Roman"/>
                 <w:b w:val="0"/>
-                <w:sz w:val="16"/>
+                <w:sz w:val="15"/>
               </w:rPr>
-              <w:t>51.50</w:t>
+              <w:t>49.74</w:t>
+            </w:r>
+          </w:p>
+        </w:tc>
+        <w:tc>
+          <w:tcPr>
+            <w:tcW w:type="dxa" w:w="1123"/>
+            <w:vAlign w:val="center"/>
+          </w:tcPr>
+          <w:p>
+            <w:pPr>
+              <w:spacing w:before="0" w:after="0"/>
+              <w:jc w:val="center"/>
+            </w:pPr>
+            <w:r>
+              <w:rPr>
+                <w:rFonts w:ascii="Times New Roman" w:hAnsi="Times New Roman"/>
+                <w:b w:val="0"/>
+                <w:sz w:val="15"/>
+              </w:rPr>
+              <w:t>3.61</w:t>
             </w:r>
           </w:p>
         </w:tc>
@@ -841,7 +933,7 @@
       <w:tr>
         <w:tc>
           <w:tcPr>
-            <w:tcW w:type="dxa" w:w="2304"/>
+            <w:tcW w:type="dxa" w:w="1829"/>
             <w:vAlign w:val="center"/>
             <w:tcMar>
               <w:top w:w="40" w:type="dxa"/>
@@ -851,20 +943,23 @@
             </w:tcMar>
           </w:tcPr>
           <w:p>
-            <w:pPr/>
+            <w:pPr>
+              <w:spacing w:before="0" w:after="0"/>
+              <w:jc w:val="left"/>
+            </w:pPr>
             <w:r>
               <w:rPr>
                 <w:rFonts w:ascii="Times New Roman" w:hAnsi="Times New Roman"/>
                 <w:b w:val="0"/>
-                <w:sz w:val="16"/>
+                <w:sz w:val="15"/>
               </w:rPr>
-              <w:t>LLM zero-shot</w:t>
+              <w:t>Fine-tuned NLLB</w:t>
             </w:r>
           </w:p>
         </w:tc>
         <w:tc>
           <w:tcPr>
-            <w:tcW w:type="dxa" w:w="1051"/>
+            <w:tcW w:type="dxa" w:w="720"/>
             <w:vAlign w:val="center"/>
             <w:tcMar>
               <w:top w:w="40" w:type="dxa"/>
@@ -874,20 +969,23 @@
             </w:tcMar>
           </w:tcPr>
           <w:p>
-            <w:pPr/>
+            <w:pPr>
+              <w:spacing w:before="0" w:after="0"/>
+              <w:jc w:val="center"/>
+            </w:pPr>
             <w:r>
               <w:rPr>
                 <w:rFonts w:ascii="Times New Roman" w:hAnsi="Times New Roman"/>
                 <w:b w:val="0"/>
-                <w:sz w:val="16"/>
+                <w:sz w:val="15"/>
               </w:rPr>
-              <w:t>16.43</w:t>
+              <w:t>16.07</w:t>
             </w:r>
           </w:p>
         </w:tc>
         <w:tc>
           <w:tcPr>
-            <w:tcW w:type="dxa" w:w="1051"/>
+            <w:tcW w:type="dxa" w:w="720"/>
             <w:vAlign w:val="center"/>
             <w:tcMar>
               <w:top w:w="40" w:type="dxa"/>
@@ -897,14 +995,37 @@
             </w:tcMar>
           </w:tcPr>
           <w:p>
-            <w:pPr/>
+            <w:pPr>
+              <w:spacing w:before="0" w:after="0"/>
+              <w:jc w:val="center"/>
+            </w:pPr>
             <w:r>
               <w:rPr>
                 <w:rFonts w:ascii="Times New Roman" w:hAnsi="Times New Roman"/>
                 <w:b w:val="0"/>
-                <w:sz w:val="16"/>
+                <w:sz w:val="15"/>
               </w:rPr>
-              <w:t>49.74</w:t>
+              <w:t>51.50</w:t>
+            </w:r>
+          </w:p>
+        </w:tc>
+        <w:tc>
+          <w:tcPr>
+            <w:tcW w:type="dxa" w:w="1123"/>
+            <w:vAlign w:val="center"/>
+          </w:tcPr>
+          <w:p>
+            <w:pPr>
+              <w:spacing w:before="0" w:after="0"/>
+              <w:jc w:val="center"/>
+            </w:pPr>
+            <w:r>
+              <w:rPr>
+                <w:rFonts w:ascii="Times New Roman" w:hAnsi="Times New Roman"/>
+                <w:b w:val="0"/>
+                <w:sz w:val="15"/>
+              </w:rPr>
+              <w:t>3.57</w:t>
             </w:r>
           </w:p>
         </w:tc>
@@ -944,9 +1065,8 @@
           <w:b w:val="0"/>
           <w:i w:val="0"/>
           <w:sz w:val="20"/>
-          <w:caps w:val="0"/>
         </w:rPr>
-        <w:t>Table I shows that supervised adaptation improves the original NLLB zero-shot baseline on both aggregate metrics. BLEU increases from 15.89 to 16.07 (+0.18), while chrF rises from 49.97 to 51.50 (+1.53). The general-purpose LLM obtains the highest BLEU score, 16.43, but its chrF score is 49.74, below both the fine-tuned system and the NLLB baseline. The ranking difference illustrates that BLEU and chrF capture complementary aspects of translation quality.</w:t>
+        <w:t>Table I shows that supervised adaptation improves the original NLLB zero-shot baseline on all reported measures. BLEU increases from 15.89 to 16.07 (+0.18), chrF rises from 49.97 to 51.50 (+1.53), and the mean human rating increases from 3.43 to 3.57 (+0.14). The general-purpose LLM obtains the highest BLEU score, 16.43, and the highest mean human rating, 3.61, but its chrF score is 49.74. The different rankings show that automatic overlap metrics and human judgments capture complementary aspects of translation quality.</w:t>
       </w:r>
     </w:p>
     <w:p>
@@ -964,9 +1084,8 @@
           <w:b w:val="0"/>
           <w:i w:val="0"/>
           <w:sz w:val="20"/>
-          <w:caps w:val="0"/>
         </w:rPr>
-        <w:t>Sentence-level inspection supports this interpretation. In a selected example concerning a route around the Transantarctic Mountains, the fine-tuned output uses target-oriented forms such as “Sti,” “i xe,” “na longa,” and “par rivare,” moving closer to the Venetian reference than the unchanged checkpoint. Other examples still exhibit lexical substitutions, omissions, or unstable spelling, so the corpus-level gain should not be interpreted as uniform improvement on every sentence.</w:t>
+        <w:t>Sentence-level chrF inspection supports this interpretation: the fine-tuned system improves 44 of 82 test sentences, regresses on 37, and ties on one. In a selected example concerning a route around the Transantarctic Mountains, the adapted output uses target-oriented forms such as “Sti,” “i xe,” “na longa,” and “par rivare,” moving closer to the Venetian reference than the unchanged checkpoint. Other examples still exhibit lexical substitutions, omissions, or unstable spelling, so the aggregate gain should not be interpreted as uniform improvement on every sentence.</w:t>
       </w:r>
     </w:p>
     <w:p>
@@ -984,9 +1103,8 @@
           <w:b w:val="0"/>
           <w:i w:val="0"/>
           <w:sz w:val="20"/>
-          <w:caps w:val="0"/>
         </w:rPr>
-        <w:t>The relatively larger chrF gain suggests that adaptation chiefly improves character-level, morphological, and orthographic correspondence with the references. The smaller BLEU gain indicates that exact word sequences and longer phrase structure remain difficult. The LLM baseline shows the opposite trade-off: stronger word-level overlap but slightly weaker character-level agreement, potentially reflecting fluent paraphrases or alternative Venetian forms that differ from the single reference.</w:t>
+        <w:t>The relatively larger chrF gain suggests that adaptation chiefly improves character-level, morphological, and orthographic correspondence with the references. The smaller BLEU gain indicates that exact word sequences and longer phrase structure remain difficult. The fine-tuned model’s human rating is close to the LLM result and above the NLLB baseline, supporting the usefulness of target-language adaptation. The LLM’s highest human rating despite lower chrF also illustrates how fluent or acceptable alternatives can diverge from a single reference.</w:t>
       </w:r>
     </w:p>
     <w:p>
@@ -1043,9 +1161,8 @@
           <w:b w:val="0"/>
           <w:i w:val="0"/>
           <w:sz w:val="20"/>
-          <w:caps w:val="0"/>
         </w:rPr>
-        <w:t>The findings should therefore be interpreted as evidence of useful but incomplete adaptation. The small test set and single-reference design limit the strength of conclusions, and the observed differences have not yet been tested for statistical significance. BLEU and chrF quantify overlap with one reference but cannot determine whether a divergent output is fluent, semantically correct, or acceptable in another Venetian variety. No expert human ratings were available, and the experiment covers one model scale and one principal fine-tuning configuration.</w:t>
+        <w:t>These findings indicate useful but incomplete adaptation. The small test set, single-reference design, and lack of significance testing limit the strength of conclusions. BLEU and chrF measure overlap with one reference; human scores add a descriptive signal, but the released data contain one saved score per output and no inter-rater agreement statistic. The experiment also covers one model scale and one principal fine-tuning configuration.</w:t>
       </w:r>
     </w:p>
     <w:p>
@@ -1063,9 +1180,8 @@
           <w:b w:val="0"/>
           <w:i w:val="0"/>
           <w:sz w:val="20"/>
-          <w:caps w:val="0"/>
         </w:rPr>
-        <w:t>Future work should enlarge the parallel corpus, record dialect and provenance metadata, compare normalized and non-normalized targets, and incorporate multiple references or expert human judgments. Repeated runs with controlled seeds and bootstrap significance testing would help distinguish systematic gains from sampling and training variance. Data selection may be as important as volume: balancing domains, removing near-duplicates, and prioritizing high-frequency morphology could improve sample efficiency. Targeted analysis of named entities, idioms, clitic constructions, and function words could further reveal where multilingual transfer is beneficial and where explicit linguistic resources are needed.</w:t>
+        <w:t>Future work should enlarge the corpus, record dialect and provenance metadata, compare normalized and non-normalized targets, and use multiple references and calibrated multi-rater evaluation. Controlled seeds, bootstrap significance tests, and agreement analysis would separate systematic gains from sampling, training, and annotation variance. Domain balancing, deduplication, and targeted coverage of morphology, named entities, idioms, and clitics may improve sample efficiency.</w:t>
       </w:r>
     </w:p>
     <w:p>
@@ -1102,9 +1218,8 @@
           <w:b w:val="0"/>
           <w:i w:val="0"/>
           <w:sz w:val="20"/>
-          <w:caps w:val="0"/>
         </w:rPr>
-        <w:t>This study presents an expanded English-to-Venetian translation pipeline based on NLLB-200. Fine-tuning on 653 sentence pairs improves the original NLLB zero-shot baseline from 15.89 to 16.07 BLEU and from 49.97 to 51.50 chrF. A general-purpose LLM reaches the highest BLEU score, while the fine-tuned NLLB system achieves the strongest chrF result. These findings show that supervised adaptation can yield measurable gains even under severe data scarcity, while also underscoring the importance of corpus design, dialect-aware normalization, multiple metrics, and human-centered evaluation. The released workflow and interactive demo support transparent inspection of aggregate results, sentence-level behavior, and free-text translation.</w:t>
+        <w:t>This study presents an expanded English-to-Venetian translation pipeline based on NLLB-200. Fine-tuning on 653 pairs improves NLLB zero-shot from 15.89 to 16.07 BLEU, from 49.97 to 51.50 chrF, and from 3.43 to 3.57 in mean human rating. A general-purpose LLM leads on BLEU and human rating, while fine-tuned NLLB leads on chrF. The findings show useful adaptation under severe data scarcity and emphasize corpus design, dialect-aware normalization, complementary metrics, and careful human evaluation. The released workflow and demo support inspection of aggregate, sentence-level, human-score, and free-text behavior.</w:t>
       </w:r>
     </w:p>
     <w:p>

</xml_diff>